<commit_message>
finished my comments and annotations for the second page of networking_structure_diagram_planning.docx
</commit_message>
<xml_diff>
--- a/Iteration_2/Echo_Networking/networking_structure_diagram_planning.docx
+++ b/Iteration_2/Echo_Networking/networking_structure_diagram_planning.docx
@@ -169,49 +169,7 @@
         <w:rPr>
           <w:rFonts w:ascii="Times New Roman" w:eastAsia="Times New Roman" w:hAnsi="Times New Roman" w:cs="Times New Roman"/>
         </w:rPr>
-        <w:t xml:space="preserve">: Managing the networking loop, multithreading, and coordinating other networking operations (e.g., </w:t>
-      </w:r>
-      <w:proofErr w:type="spellStart"/>
-      <w:r>
-        <w:rPr>
-          <w:rFonts w:ascii="Times New Roman" w:eastAsia="Times New Roman" w:hAnsi="Times New Roman" w:cs="Times New Roman"/>
-        </w:rPr>
-        <w:t>requestGame</w:t>
-      </w:r>
-      <w:proofErr w:type="spellEnd"/>
-      <w:r>
-        <w:rPr>
-          <w:rFonts w:ascii="Times New Roman" w:eastAsia="Times New Roman" w:hAnsi="Times New Roman" w:cs="Times New Roman"/>
-        </w:rPr>
-        <w:t xml:space="preserve">, </w:t>
-      </w:r>
-      <w:proofErr w:type="spellStart"/>
-      <w:r>
-        <w:rPr>
-          <w:rFonts w:ascii="Times New Roman" w:eastAsia="Times New Roman" w:hAnsi="Times New Roman" w:cs="Times New Roman"/>
-        </w:rPr>
-        <w:t>sendData</w:t>
-      </w:r>
-      <w:proofErr w:type="spellEnd"/>
-      <w:r>
-        <w:rPr>
-          <w:rFonts w:ascii="Times New Roman" w:eastAsia="Times New Roman" w:hAnsi="Times New Roman" w:cs="Times New Roman"/>
-        </w:rPr>
-        <w:t xml:space="preserve">, </w:t>
-      </w:r>
-      <w:proofErr w:type="spellStart"/>
-      <w:r>
-        <w:rPr>
-          <w:rFonts w:ascii="Times New Roman" w:eastAsia="Times New Roman" w:hAnsi="Times New Roman" w:cs="Times New Roman"/>
-        </w:rPr>
-        <w:t>receiveData</w:t>
-      </w:r>
-      <w:proofErr w:type="spellEnd"/>
-      <w:r>
-        <w:rPr>
-          <w:rFonts w:ascii="Times New Roman" w:eastAsia="Times New Roman" w:hAnsi="Times New Roman" w:cs="Times New Roman"/>
-        </w:rPr>
-        <w:t>).</w:t>
+        <w:t>: Managing the networking loop, multithreading, and coordinating other networking operations (e.g., requestGame, sendData, receiveData).</w:t>
       </w:r>
     </w:p>
     <w:p>
@@ -228,7 +186,6 @@
           <w:rFonts w:ascii="Times New Roman" w:eastAsia="Times New Roman" w:hAnsi="Times New Roman" w:cs="Times New Roman"/>
         </w:rPr>
       </w:pPr>
-      <w:proofErr w:type="spellStart"/>
       <w:r>
         <w:rPr>
           <w:rFonts w:ascii="Times New Roman" w:eastAsia="Times New Roman" w:hAnsi="Times New Roman" w:cs="Times New Roman"/>
@@ -236,7 +193,6 @@
         </w:rPr>
         <w:t>AuthenticationHandler</w:t>
       </w:r>
-      <w:proofErr w:type="spellEnd"/>
       <w:r>
         <w:rPr>
           <w:rFonts w:ascii="Times New Roman" w:eastAsia="Times New Roman" w:hAnsi="Times New Roman" w:cs="Times New Roman"/>
@@ -325,7 +281,6 @@
           <w:rFonts w:ascii="Times New Roman" w:eastAsia="Times New Roman" w:hAnsi="Times New Roman" w:cs="Times New Roman"/>
         </w:rPr>
       </w:pPr>
-      <w:proofErr w:type="spellStart"/>
       <w:r>
         <w:rPr>
           <w:rFonts w:ascii="Times New Roman" w:eastAsia="Times New Roman" w:hAnsi="Times New Roman" w:cs="Times New Roman"/>
@@ -333,7 +288,6 @@
         </w:rPr>
         <w:t>LeaderboardHandler</w:t>
       </w:r>
-      <w:proofErr w:type="spellEnd"/>
       <w:r>
         <w:rPr>
           <w:rFonts w:ascii="Times New Roman" w:eastAsia="Times New Roman" w:hAnsi="Times New Roman" w:cs="Times New Roman"/>
@@ -397,7 +351,6 @@
           <w:rFonts w:ascii="Times New Roman" w:eastAsia="Times New Roman" w:hAnsi="Times New Roman" w:cs="Times New Roman"/>
         </w:rPr>
       </w:pPr>
-      <w:proofErr w:type="spellStart"/>
       <w:r>
         <w:rPr>
           <w:rFonts w:ascii="Times New Roman" w:eastAsia="Times New Roman" w:hAnsi="Times New Roman" w:cs="Times New Roman"/>
@@ -405,7 +358,6 @@
         </w:rPr>
         <w:t>ChatManager</w:t>
       </w:r>
-      <w:proofErr w:type="spellEnd"/>
       <w:r>
         <w:rPr>
           <w:rFonts w:ascii="Times New Roman" w:eastAsia="Times New Roman" w:hAnsi="Times New Roman" w:cs="Times New Roman"/>
@@ -494,7 +446,6 @@
           <w:rFonts w:ascii="Times New Roman" w:eastAsia="Times New Roman" w:hAnsi="Times New Roman" w:cs="Times New Roman"/>
         </w:rPr>
       </w:pPr>
-      <w:proofErr w:type="spellStart"/>
       <w:r>
         <w:rPr>
           <w:rFonts w:ascii="Times New Roman" w:eastAsia="Times New Roman" w:hAnsi="Times New Roman" w:cs="Times New Roman"/>
@@ -502,7 +453,6 @@
         </w:rPr>
         <w:t>GameSyncManager</w:t>
       </w:r>
-      <w:proofErr w:type="spellEnd"/>
       <w:r>
         <w:rPr>
           <w:rFonts w:ascii="Times New Roman" w:eastAsia="Times New Roman" w:hAnsi="Times New Roman" w:cs="Times New Roman"/>
@@ -600,7 +550,6 @@
           <w:commentRangeStart w:id="7"/>
         </w:sdtContent>
       </w:sdt>
-      <w:proofErr w:type="spellStart"/>
       <w:r>
         <w:rPr>
           <w:rFonts w:ascii="Times New Roman" w:eastAsia="Times New Roman" w:hAnsi="Times New Roman" w:cs="Times New Roman"/>
@@ -608,7 +557,6 @@
         </w:rPr>
         <w:t>ServerRelay</w:t>
       </w:r>
-      <w:proofErr w:type="spellEnd"/>
       <w:r>
         <w:rPr>
           <w:rFonts w:ascii="Times New Roman" w:eastAsia="Times New Roman" w:hAnsi="Times New Roman" w:cs="Times New Roman"/>
@@ -752,35 +700,7 @@
         <w:rPr>
           <w:rFonts w:ascii="Times New Roman" w:eastAsia="Times New Roman" w:hAnsi="Times New Roman" w:cs="Times New Roman"/>
         </w:rPr>
-        <w:t xml:space="preserve">: </w:t>
-      </w:r>
-      <w:proofErr w:type="spellStart"/>
-      <w:r>
-        <w:rPr>
-          <w:rFonts w:ascii="Times New Roman" w:eastAsia="Times New Roman" w:hAnsi="Times New Roman" w:cs="Times New Roman"/>
-        </w:rPr>
-        <w:t>msgToBeSent</w:t>
-      </w:r>
-      <w:proofErr w:type="spellEnd"/>
-      <w:r>
-        <w:rPr>
-          <w:rFonts w:ascii="Times New Roman" w:eastAsia="Times New Roman" w:hAnsi="Times New Roman" w:cs="Times New Roman"/>
-        </w:rPr>
-        <w:t xml:space="preserve">, </w:t>
-      </w:r>
-      <w:proofErr w:type="spellStart"/>
-      <w:r>
-        <w:rPr>
-          <w:rFonts w:ascii="Times New Roman" w:eastAsia="Times New Roman" w:hAnsi="Times New Roman" w:cs="Times New Roman"/>
-        </w:rPr>
-        <w:t>connectionStatus</w:t>
-      </w:r>
-      <w:proofErr w:type="spellEnd"/>
-      <w:r>
-        <w:rPr>
-          <w:rFonts w:ascii="Times New Roman" w:eastAsia="Times New Roman" w:hAnsi="Times New Roman" w:cs="Times New Roman"/>
-        </w:rPr>
-        <w:t>, etc.</w:t>
+        <w:t>: msgToBeSent, connectionStatus, etc.</w:t>
       </w:r>
     </w:p>
     <w:p>
@@ -804,21 +724,21 @@
         <w:rPr>
           <w:rFonts w:ascii="Times New Roman" w:eastAsia="Times New Roman" w:hAnsi="Times New Roman" w:cs="Times New Roman"/>
         </w:rPr>
-        <w:t>: </w:t>
-      </w:r>
-      <w:proofErr w:type="gramStart"/>
-      <w:r>
-        <w:rPr>
-          <w:rFonts w:ascii="Times New Roman" w:eastAsia="Times New Roman" w:hAnsi="Times New Roman" w:cs="Times New Roman"/>
-        </w:rPr>
-        <w:t>run(</w:t>
-      </w:r>
-      <w:proofErr w:type="gramEnd"/>
-      <w:r>
-        <w:rPr>
-          <w:rFonts w:ascii="Times New Roman" w:eastAsia="Times New Roman" w:hAnsi="Times New Roman" w:cs="Times New Roman"/>
-        </w:rPr>
-        <w:t>), start(), requestGame(), sendData(), receiveData(), preLoop()</w:t>
+        <w:t>: run(), start(), requestGame(), sendData(), receiveData(), </w:t>
+      </w:r>
+      <w:commentRangeStart w:id="9"/>
+      <w:r>
+        <w:rPr>
+          <w:rFonts w:ascii="Times New Roman" w:eastAsia="Times New Roman" w:hAnsi="Times New Roman" w:cs="Times New Roman"/>
+        </w:rPr>
+        <w:t>preLoop()</w:t>
+      </w:r>
+      <w:commentRangeEnd w:id="9"/>
+      <w:r>
+        <w:rPr>
+          <w:rStyle w:val="CommentReference"/>
+        </w:rPr>
+        <w:commentReference w:id="9"/>
       </w:r>
     </w:p>
     <w:p>
@@ -831,7 +751,7 @@
           <w:rFonts w:ascii="Times New Roman" w:eastAsia="Times New Roman" w:hAnsi="Times New Roman" w:cs="Times New Roman"/>
         </w:rPr>
       </w:pPr>
-      <w:proofErr w:type="spellStart"/>
+      <w:commentRangeStart w:id="10"/>
       <w:r>
         <w:rPr>
           <w:rFonts w:ascii="Times New Roman" w:eastAsia="Times New Roman" w:hAnsi="Times New Roman" w:cs="Times New Roman"/>
@@ -839,12 +759,24 @@
         </w:rPr>
         <w:t>AuthenticationHandler</w:t>
       </w:r>
-      <w:proofErr w:type="spellEnd"/>
-      <w:r>
-        <w:rPr>
-          <w:rFonts w:ascii="Times New Roman" w:eastAsia="Times New Roman" w:hAnsi="Times New Roman" w:cs="Times New Roman"/>
-        </w:rPr>
-        <w:t>: Manages the functions related to login, registration, and communication with the Authentication team.</w:t>
+      <w:r>
+        <w:rPr>
+          <w:rFonts w:ascii="Times New Roman" w:eastAsia="Times New Roman" w:hAnsi="Times New Roman" w:cs="Times New Roman"/>
+        </w:rPr>
+        <w:t xml:space="preserve">: </w:t>
+      </w:r>
+      <w:commentRangeEnd w:id="10"/>
+      <w:r>
+        <w:rPr>
+          <w:rStyle w:val="CommentReference"/>
+        </w:rPr>
+        <w:commentReference w:id="10"/>
+      </w:r>
+      <w:r>
+        <w:rPr>
+          <w:rFonts w:ascii="Times New Roman" w:eastAsia="Times New Roman" w:hAnsi="Times New Roman" w:cs="Times New Roman"/>
+        </w:rPr>
+        <w:t>Manages the functions related to login, registration, and communication with the Authentication team.</w:t>
       </w:r>
     </w:p>
     <w:p>
@@ -868,7 +800,21 @@
         <w:rPr>
           <w:rFonts w:ascii="Times New Roman" w:eastAsia="Times New Roman" w:hAnsi="Times New Roman" w:cs="Times New Roman"/>
         </w:rPr>
-        <w:t>: Username, password</w:t>
+        <w:t xml:space="preserve">: Username, </w:t>
+      </w:r>
+      <w:commentRangeStart w:id="11"/>
+      <w:r>
+        <w:rPr>
+          <w:rFonts w:ascii="Times New Roman" w:eastAsia="Times New Roman" w:hAnsi="Times New Roman" w:cs="Times New Roman"/>
+        </w:rPr>
+        <w:t>password</w:t>
+      </w:r>
+      <w:commentRangeEnd w:id="11"/>
+      <w:r>
+        <w:rPr>
+          <w:rStyle w:val="CommentReference"/>
+        </w:rPr>
+        <w:commentReference w:id="11"/>
       </w:r>
     </w:p>
     <w:p>
@@ -892,21 +838,27 @@
         <w:rPr>
           <w:rFonts w:ascii="Times New Roman" w:eastAsia="Times New Roman" w:hAnsi="Times New Roman" w:cs="Times New Roman"/>
         </w:rPr>
-        <w:t>: </w:t>
-      </w:r>
-      <w:proofErr w:type="gramStart"/>
-      <w:r>
-        <w:rPr>
-          <w:rFonts w:ascii="Times New Roman" w:eastAsia="Times New Roman" w:hAnsi="Times New Roman" w:cs="Times New Roman"/>
-        </w:rPr>
-        <w:t>prepareLoginData(</w:t>
-      </w:r>
-      <w:proofErr w:type="gramEnd"/>
-      <w:r>
-        <w:rPr>
-          <w:rFonts w:ascii="Times New Roman" w:eastAsia="Times New Roman" w:hAnsi="Times New Roman" w:cs="Times New Roman"/>
-        </w:rPr>
-        <w:t>), checkAuthentication(), prepareRegistrationData(), receiveAuthResponse()</w:t>
+        <w:t>: prepareLoginData(), </w:t>
+      </w:r>
+      <w:commentRangeStart w:id="12"/>
+      <w:r>
+        <w:rPr>
+          <w:rFonts w:ascii="Times New Roman" w:eastAsia="Times New Roman" w:hAnsi="Times New Roman" w:cs="Times New Roman"/>
+        </w:rPr>
+        <w:t>checkAuthentication(), </w:t>
+      </w:r>
+      <w:commentRangeEnd w:id="12"/>
+      <w:r>
+        <w:rPr>
+          <w:rStyle w:val="CommentReference"/>
+        </w:rPr>
+        <w:commentReference w:id="12"/>
+      </w:r>
+      <w:r>
+        <w:rPr>
+          <w:rFonts w:ascii="Times New Roman" w:eastAsia="Times New Roman" w:hAnsi="Times New Roman" w:cs="Times New Roman"/>
+        </w:rPr>
+        <w:t>prepareRegistrationData(), receiveAuthResponse()</w:t>
       </w:r>
     </w:p>
     <w:p>
@@ -919,7 +871,7 @@
           <w:rFonts w:ascii="Times New Roman" w:eastAsia="Times New Roman" w:hAnsi="Times New Roman" w:cs="Times New Roman"/>
         </w:rPr>
       </w:pPr>
-      <w:proofErr w:type="spellStart"/>
+      <w:commentRangeStart w:id="13"/>
       <w:r>
         <w:rPr>
           <w:rFonts w:ascii="Times New Roman" w:eastAsia="Times New Roman" w:hAnsi="Times New Roman" w:cs="Times New Roman"/>
@@ -927,12 +879,24 @@
         </w:rPr>
         <w:t>LeaderboardHandler</w:t>
       </w:r>
-      <w:proofErr w:type="spellEnd"/>
-      <w:r>
-        <w:rPr>
-          <w:rFonts w:ascii="Times New Roman" w:eastAsia="Times New Roman" w:hAnsi="Times New Roman" w:cs="Times New Roman"/>
-        </w:rPr>
-        <w:t>: Coordinates leaderboard data with the Leaderboard &amp; Matchmaking team.</w:t>
+      <w:r>
+        <w:rPr>
+          <w:rFonts w:ascii="Times New Roman" w:eastAsia="Times New Roman" w:hAnsi="Times New Roman" w:cs="Times New Roman"/>
+        </w:rPr>
+        <w:t xml:space="preserve">: </w:t>
+      </w:r>
+      <w:commentRangeEnd w:id="13"/>
+      <w:r>
+        <w:rPr>
+          <w:rStyle w:val="CommentReference"/>
+        </w:rPr>
+        <w:commentReference w:id="13"/>
+      </w:r>
+      <w:r>
+        <w:rPr>
+          <w:rFonts w:ascii="Times New Roman" w:eastAsia="Times New Roman" w:hAnsi="Times New Roman" w:cs="Times New Roman"/>
+        </w:rPr>
+        <w:t>Coordinates leaderboard data with the Leaderboard &amp; Matchmaking team.</w:t>
       </w:r>
     </w:p>
     <w:p>
@@ -956,16 +920,8 @@
         <w:rPr>
           <w:rFonts w:ascii="Times New Roman" w:eastAsia="Times New Roman" w:hAnsi="Times New Roman" w:cs="Times New Roman"/>
         </w:rPr>
-        <w:t xml:space="preserve">: </w:t>
-      </w:r>
-      <w:proofErr w:type="spellStart"/>
-      <w:r>
-        <w:rPr>
-          <w:rFonts w:ascii="Times New Roman" w:eastAsia="Times New Roman" w:hAnsi="Times New Roman" w:cs="Times New Roman"/>
-        </w:rPr>
-        <w:t>leaderboardData</w:t>
-      </w:r>
-      <w:proofErr w:type="spellEnd"/>
+        <w:t>: leaderboardData</w:t>
+      </w:r>
     </w:p>
     <w:p>
       <w:pPr>
@@ -988,21 +944,7 @@
         <w:rPr>
           <w:rFonts w:ascii="Times New Roman" w:eastAsia="Times New Roman" w:hAnsi="Times New Roman" w:cs="Times New Roman"/>
         </w:rPr>
-        <w:t>: </w:t>
-      </w:r>
-      <w:proofErr w:type="gramStart"/>
-      <w:r>
-        <w:rPr>
-          <w:rFonts w:ascii="Times New Roman" w:eastAsia="Times New Roman" w:hAnsi="Times New Roman" w:cs="Times New Roman"/>
-        </w:rPr>
-        <w:t>requestLeaderboard(</w:t>
-      </w:r>
-      <w:proofErr w:type="gramEnd"/>
-      <w:r>
-        <w:rPr>
-          <w:rFonts w:ascii="Times New Roman" w:eastAsia="Times New Roman" w:hAnsi="Times New Roman" w:cs="Times New Roman"/>
-        </w:rPr>
-        <w:t>), updateLeaderboard(), saveLeaderboardData()</w:t>
+        <w:t>: requestLeaderboard(), updateLeaderboard(), saveLeaderboardData()</w:t>
       </w:r>
     </w:p>
     <w:p>
@@ -1015,7 +957,7 @@
           <w:rFonts w:ascii="Times New Roman" w:eastAsia="Times New Roman" w:hAnsi="Times New Roman" w:cs="Times New Roman"/>
         </w:rPr>
       </w:pPr>
-      <w:proofErr w:type="spellStart"/>
+      <w:commentRangeStart w:id="14"/>
       <w:r>
         <w:rPr>
           <w:rFonts w:ascii="Times New Roman" w:eastAsia="Times New Roman" w:hAnsi="Times New Roman" w:cs="Times New Roman"/>
@@ -1023,12 +965,24 @@
         </w:rPr>
         <w:t>ChatManager</w:t>
       </w:r>
-      <w:proofErr w:type="spellEnd"/>
-      <w:r>
-        <w:rPr>
-          <w:rFonts w:ascii="Times New Roman" w:eastAsia="Times New Roman" w:hAnsi="Times New Roman" w:cs="Times New Roman"/>
-        </w:rPr>
-        <w:t>: Handles chat communication between clients.</w:t>
+      <w:r>
+        <w:rPr>
+          <w:rFonts w:ascii="Times New Roman" w:eastAsia="Times New Roman" w:hAnsi="Times New Roman" w:cs="Times New Roman"/>
+        </w:rPr>
+        <w:t xml:space="preserve">: </w:t>
+      </w:r>
+      <w:commentRangeEnd w:id="14"/>
+      <w:r>
+        <w:rPr>
+          <w:rStyle w:val="CommentReference"/>
+        </w:rPr>
+        <w:commentReference w:id="14"/>
+      </w:r>
+      <w:r>
+        <w:rPr>
+          <w:rFonts w:ascii="Times New Roman" w:eastAsia="Times New Roman" w:hAnsi="Times New Roman" w:cs="Times New Roman"/>
+        </w:rPr>
+        <w:t>Handles chat communication between clients.</w:t>
       </w:r>
     </w:p>
     <w:p>
@@ -1052,30 +1006,8 @@
         <w:rPr>
           <w:rFonts w:ascii="Times New Roman" w:eastAsia="Times New Roman" w:hAnsi="Times New Roman" w:cs="Times New Roman"/>
         </w:rPr>
-        <w:t xml:space="preserve">: </w:t>
-      </w:r>
-      <w:proofErr w:type="spellStart"/>
-      <w:r>
-        <w:rPr>
-          <w:rFonts w:ascii="Times New Roman" w:eastAsia="Times New Roman" w:hAnsi="Times New Roman" w:cs="Times New Roman"/>
-        </w:rPr>
-        <w:t>messageQueue</w:t>
-      </w:r>
-      <w:proofErr w:type="spellEnd"/>
-      <w:r>
-        <w:rPr>
-          <w:rFonts w:ascii="Times New Roman" w:eastAsia="Times New Roman" w:hAnsi="Times New Roman" w:cs="Times New Roman"/>
-        </w:rPr>
-        <w:t>, </w:t>
-      </w:r>
-      <w:proofErr w:type="spellStart"/>
-      <w:r>
-        <w:rPr>
-          <w:rFonts w:ascii="Times New Roman" w:eastAsia="Times New Roman" w:hAnsi="Times New Roman" w:cs="Times New Roman"/>
-        </w:rPr>
-        <w:t>msgToBeSent</w:t>
-      </w:r>
-      <w:proofErr w:type="spellEnd"/>
+        <w:t>: messageQueue, msgToBeSent</w:t>
+      </w:r>
     </w:p>
     <w:p>
       <w:pPr>
@@ -1098,57 +1030,7 @@
         <w:rPr>
           <w:rFonts w:ascii="Times New Roman" w:eastAsia="Times New Roman" w:hAnsi="Times New Roman" w:cs="Times New Roman"/>
         </w:rPr>
-        <w:t>: </w:t>
-      </w:r>
-      <w:proofErr w:type="spellStart"/>
-      <w:proofErr w:type="gramStart"/>
-      <w:r>
-        <w:rPr>
-          <w:rFonts w:ascii="Times New Roman" w:eastAsia="Times New Roman" w:hAnsi="Times New Roman" w:cs="Times New Roman"/>
-        </w:rPr>
-        <w:t>sendMessage</w:t>
-      </w:r>
-      <w:proofErr w:type="spellEnd"/>
-      <w:r>
-        <w:rPr>
-          <w:rFonts w:ascii="Times New Roman" w:eastAsia="Times New Roman" w:hAnsi="Times New Roman" w:cs="Times New Roman"/>
-        </w:rPr>
-        <w:t>(</w:t>
-      </w:r>
-      <w:proofErr w:type="gramEnd"/>
-      <w:r>
-        <w:rPr>
-          <w:rFonts w:ascii="Times New Roman" w:eastAsia="Times New Roman" w:hAnsi="Times New Roman" w:cs="Times New Roman"/>
-        </w:rPr>
-        <w:t>Message msg), </w:t>
-      </w:r>
-      <w:proofErr w:type="spellStart"/>
-      <w:r>
-        <w:rPr>
-          <w:rFonts w:ascii="Times New Roman" w:eastAsia="Times New Roman" w:hAnsi="Times New Roman" w:cs="Times New Roman"/>
-        </w:rPr>
-        <w:t>receiveMessage</w:t>
-      </w:r>
-      <w:proofErr w:type="spellEnd"/>
-      <w:r>
-        <w:rPr>
-          <w:rFonts w:ascii="Times New Roman" w:eastAsia="Times New Roman" w:hAnsi="Times New Roman" w:cs="Times New Roman"/>
-        </w:rPr>
-        <w:t>(), </w:t>
-      </w:r>
-      <w:proofErr w:type="spellStart"/>
-      <w:r>
-        <w:rPr>
-          <w:rFonts w:ascii="Times New Roman" w:eastAsia="Times New Roman" w:hAnsi="Times New Roman" w:cs="Times New Roman"/>
-        </w:rPr>
-        <w:t>decodeMessage</w:t>
-      </w:r>
-      <w:proofErr w:type="spellEnd"/>
-      <w:r>
-        <w:rPr>
-          <w:rFonts w:ascii="Times New Roman" w:eastAsia="Times New Roman" w:hAnsi="Times New Roman" w:cs="Times New Roman"/>
-        </w:rPr>
-        <w:t>()</w:t>
+        <w:t>: sendMessage(Message msg), receiveMessage(), decodeMessage()</w:t>
       </w:r>
     </w:p>
     <w:p>
@@ -1161,7 +1043,6 @@
           <w:rFonts w:ascii="Times New Roman" w:eastAsia="Times New Roman" w:hAnsi="Times New Roman" w:cs="Times New Roman"/>
         </w:rPr>
       </w:pPr>
-      <w:proofErr w:type="spellStart"/>
       <w:r>
         <w:rPr>
           <w:rFonts w:ascii="Times New Roman" w:eastAsia="Times New Roman" w:hAnsi="Times New Roman" w:cs="Times New Roman"/>
@@ -1169,12 +1050,31 @@
         </w:rPr>
         <w:t>GameSyncManager</w:t>
       </w:r>
-      <w:proofErr w:type="spellEnd"/>
-      <w:r>
-        <w:rPr>
-          <w:rFonts w:ascii="Times New Roman" w:eastAsia="Times New Roman" w:hAnsi="Times New Roman" w:cs="Times New Roman"/>
-        </w:rPr>
-        <w:t>: Ensures board state synchronization between clients during gameplay.</w:t>
+      <w:r>
+        <w:rPr>
+          <w:rFonts w:ascii="Times New Roman" w:eastAsia="Times New Roman" w:hAnsi="Times New Roman" w:cs="Times New Roman"/>
+        </w:rPr>
+        <w:t xml:space="preserve">: </w:t>
+      </w:r>
+      <w:commentRangeStart w:id="15"/>
+      <w:r>
+        <w:rPr>
+          <w:rFonts w:ascii="Times New Roman" w:eastAsia="Times New Roman" w:hAnsi="Times New Roman" w:cs="Times New Roman"/>
+        </w:rPr>
+        <w:t>Ensures</w:t>
+      </w:r>
+      <w:commentRangeEnd w:id="15"/>
+      <w:r>
+        <w:rPr>
+          <w:rStyle w:val="CommentReference"/>
+        </w:rPr>
+        <w:commentReference w:id="15"/>
+      </w:r>
+      <w:r>
+        <w:rPr>
+          <w:rFonts w:ascii="Times New Roman" w:eastAsia="Times New Roman" w:hAnsi="Times New Roman" w:cs="Times New Roman"/>
+        </w:rPr>
+        <w:t xml:space="preserve"> board state synchronization between clients during gameplay.</w:t>
       </w:r>
     </w:p>
     <w:p>
@@ -1198,16 +1098,8 @@
         <w:rPr>
           <w:rFonts w:ascii="Times New Roman" w:eastAsia="Times New Roman" w:hAnsi="Times New Roman" w:cs="Times New Roman"/>
         </w:rPr>
-        <w:t xml:space="preserve">: </w:t>
-      </w:r>
-      <w:proofErr w:type="spellStart"/>
-      <w:r>
-        <w:rPr>
-          <w:rFonts w:ascii="Times New Roman" w:eastAsia="Times New Roman" w:hAnsi="Times New Roman" w:cs="Times New Roman"/>
-        </w:rPr>
-        <w:t>boardState</w:t>
-      </w:r>
-      <w:proofErr w:type="spellEnd"/>
+        <w:t>: boardState</w:t>
+      </w:r>
     </w:p>
     <w:p>
       <w:pPr>
@@ -1230,71 +1122,7 @@
         <w:rPr>
           <w:rFonts w:ascii="Times New Roman" w:eastAsia="Times New Roman" w:hAnsi="Times New Roman" w:cs="Times New Roman"/>
         </w:rPr>
-        <w:t>: </w:t>
-      </w:r>
-      <w:proofErr w:type="spellStart"/>
-      <w:proofErr w:type="gramStart"/>
-      <w:r>
-        <w:rPr>
-          <w:rFonts w:ascii="Times New Roman" w:eastAsia="Times New Roman" w:hAnsi="Times New Roman" w:cs="Times New Roman"/>
-        </w:rPr>
-        <w:t>sendBoardState</w:t>
-      </w:r>
-      <w:proofErr w:type="spellEnd"/>
-      <w:r>
-        <w:rPr>
-          <w:rFonts w:ascii="Times New Roman" w:eastAsia="Times New Roman" w:hAnsi="Times New Roman" w:cs="Times New Roman"/>
-        </w:rPr>
-        <w:t>(</w:t>
-      </w:r>
-      <w:proofErr w:type="gramEnd"/>
-      <w:r>
-        <w:rPr>
-          <w:rFonts w:ascii="Times New Roman" w:eastAsia="Times New Roman" w:hAnsi="Times New Roman" w:cs="Times New Roman"/>
-        </w:rPr>
-        <w:t>Board board), </w:t>
-      </w:r>
-      <w:proofErr w:type="spellStart"/>
-      <w:r>
-        <w:rPr>
-          <w:rFonts w:ascii="Times New Roman" w:eastAsia="Times New Roman" w:hAnsi="Times New Roman" w:cs="Times New Roman"/>
-        </w:rPr>
-        <w:t>receiveBoardState</w:t>
-      </w:r>
-      <w:proofErr w:type="spellEnd"/>
-      <w:r>
-        <w:rPr>
-          <w:rFonts w:ascii="Times New Roman" w:eastAsia="Times New Roman" w:hAnsi="Times New Roman" w:cs="Times New Roman"/>
-        </w:rPr>
-        <w:t>(), </w:t>
-      </w:r>
-      <w:proofErr w:type="spellStart"/>
-      <w:r>
-        <w:rPr>
-          <w:rFonts w:ascii="Times New Roman" w:eastAsia="Times New Roman" w:hAnsi="Times New Roman" w:cs="Times New Roman"/>
-        </w:rPr>
-        <w:t>endUserTurn</w:t>
-      </w:r>
-      <w:proofErr w:type="spellEnd"/>
-      <w:r>
-        <w:rPr>
-          <w:rFonts w:ascii="Times New Roman" w:eastAsia="Times New Roman" w:hAnsi="Times New Roman" w:cs="Times New Roman"/>
-        </w:rPr>
-        <w:t>(), </w:t>
-      </w:r>
-      <w:proofErr w:type="spellStart"/>
-      <w:r>
-        <w:rPr>
-          <w:rFonts w:ascii="Times New Roman" w:eastAsia="Times New Roman" w:hAnsi="Times New Roman" w:cs="Times New Roman"/>
-        </w:rPr>
-        <w:t>setUserTurn</w:t>
-      </w:r>
-      <w:proofErr w:type="spellEnd"/>
-      <w:r>
-        <w:rPr>
-          <w:rFonts w:ascii="Times New Roman" w:eastAsia="Times New Roman" w:hAnsi="Times New Roman" w:cs="Times New Roman"/>
-        </w:rPr>
-        <w:t>()</w:t>
+        <w:t>: sendBoardState(Board board), receiveBoardState(), endUserTurn(), setUserTurn()</w:t>
       </w:r>
     </w:p>
     <w:p>
@@ -1307,7 +1135,7 @@
           <w:rFonts w:ascii="Times New Roman" w:eastAsia="Times New Roman" w:hAnsi="Times New Roman" w:cs="Times New Roman"/>
         </w:rPr>
       </w:pPr>
-      <w:proofErr w:type="spellStart"/>
+      <w:commentRangeStart w:id="16"/>
       <w:r>
         <w:rPr>
           <w:rFonts w:ascii="Times New Roman" w:eastAsia="Times New Roman" w:hAnsi="Times New Roman" w:cs="Times New Roman"/>
@@ -1315,12 +1143,24 @@
         </w:rPr>
         <w:t>ServerRelay</w:t>
       </w:r>
-      <w:proofErr w:type="spellEnd"/>
-      <w:r>
-        <w:rPr>
-          <w:rFonts w:ascii="Times New Roman" w:eastAsia="Times New Roman" w:hAnsi="Times New Roman" w:cs="Times New Roman"/>
-        </w:rPr>
-        <w:t>: Manages server-side interactions, acting as a relay between clients.</w:t>
+      <w:r>
+        <w:rPr>
+          <w:rFonts w:ascii="Times New Roman" w:eastAsia="Times New Roman" w:hAnsi="Times New Roman" w:cs="Times New Roman"/>
+        </w:rPr>
+        <w:t xml:space="preserve">: </w:t>
+      </w:r>
+      <w:commentRangeEnd w:id="16"/>
+      <w:r>
+        <w:rPr>
+          <w:rStyle w:val="CommentReference"/>
+        </w:rPr>
+        <w:commentReference w:id="16"/>
+      </w:r>
+      <w:r>
+        <w:rPr>
+          <w:rFonts w:ascii="Times New Roman" w:eastAsia="Times New Roman" w:hAnsi="Times New Roman" w:cs="Times New Roman"/>
+        </w:rPr>
+        <w:t>Manages server-side interactions, acting as a relay between clients.</w:t>
       </w:r>
     </w:p>
     <w:p>
@@ -1344,30 +1184,8 @@
         <w:rPr>
           <w:rFonts w:ascii="Times New Roman" w:eastAsia="Times New Roman" w:hAnsi="Times New Roman" w:cs="Times New Roman"/>
         </w:rPr>
-        <w:t xml:space="preserve">: </w:t>
-      </w:r>
-      <w:proofErr w:type="spellStart"/>
-      <w:r>
-        <w:rPr>
-          <w:rFonts w:ascii="Times New Roman" w:eastAsia="Times New Roman" w:hAnsi="Times New Roman" w:cs="Times New Roman"/>
-        </w:rPr>
-        <w:t>connectedClients</w:t>
-      </w:r>
-      <w:proofErr w:type="spellEnd"/>
-      <w:r>
-        <w:rPr>
-          <w:rFonts w:ascii="Times New Roman" w:eastAsia="Times New Roman" w:hAnsi="Times New Roman" w:cs="Times New Roman"/>
-        </w:rPr>
-        <w:t xml:space="preserve">, </w:t>
-      </w:r>
-      <w:proofErr w:type="spellStart"/>
-      <w:r>
-        <w:rPr>
-          <w:rFonts w:ascii="Times New Roman" w:eastAsia="Times New Roman" w:hAnsi="Times New Roman" w:cs="Times New Roman"/>
-        </w:rPr>
-        <w:t>matchQueue</w:t>
-      </w:r>
-      <w:proofErr w:type="spellEnd"/>
+        <w:t>: connectedClients, matchQueue</w:t>
+      </w:r>
     </w:p>
     <w:p>
       <w:pPr>
@@ -1390,57 +1208,7 @@
         <w:rPr>
           <w:rFonts w:ascii="Times New Roman" w:eastAsia="Times New Roman" w:hAnsi="Times New Roman" w:cs="Times New Roman"/>
         </w:rPr>
-        <w:t>: </w:t>
-      </w:r>
-      <w:proofErr w:type="spellStart"/>
-      <w:proofErr w:type="gramStart"/>
-      <w:r>
-        <w:rPr>
-          <w:rFonts w:ascii="Times New Roman" w:eastAsia="Times New Roman" w:hAnsi="Times New Roman" w:cs="Times New Roman"/>
-        </w:rPr>
-        <w:t>authenticateClient</w:t>
-      </w:r>
-      <w:proofErr w:type="spellEnd"/>
-      <w:r>
-        <w:rPr>
-          <w:rFonts w:ascii="Times New Roman" w:eastAsia="Times New Roman" w:hAnsi="Times New Roman" w:cs="Times New Roman"/>
-        </w:rPr>
-        <w:t>(</w:t>
-      </w:r>
-      <w:proofErr w:type="gramEnd"/>
-      <w:r>
-        <w:rPr>
-          <w:rFonts w:ascii="Times New Roman" w:eastAsia="Times New Roman" w:hAnsi="Times New Roman" w:cs="Times New Roman"/>
-        </w:rPr>
-        <w:t>), </w:t>
-      </w:r>
-      <w:proofErr w:type="spellStart"/>
-      <w:r>
-        <w:rPr>
-          <w:rFonts w:ascii="Times New Roman" w:eastAsia="Times New Roman" w:hAnsi="Times New Roman" w:cs="Times New Roman"/>
-        </w:rPr>
-        <w:t>matchClients</w:t>
-      </w:r>
-      <w:proofErr w:type="spellEnd"/>
-      <w:r>
-        <w:rPr>
-          <w:rFonts w:ascii="Times New Roman" w:eastAsia="Times New Roman" w:hAnsi="Times New Roman" w:cs="Times New Roman"/>
-        </w:rPr>
-        <w:t>(), </w:t>
-      </w:r>
-      <w:proofErr w:type="spellStart"/>
-      <w:r>
-        <w:rPr>
-          <w:rFonts w:ascii="Times New Roman" w:eastAsia="Times New Roman" w:hAnsi="Times New Roman" w:cs="Times New Roman"/>
-        </w:rPr>
-        <w:t>relayData</w:t>
-      </w:r>
-      <w:proofErr w:type="spellEnd"/>
-      <w:r>
-        <w:rPr>
-          <w:rFonts w:ascii="Times New Roman" w:eastAsia="Times New Roman" w:hAnsi="Times New Roman" w:cs="Times New Roman"/>
-        </w:rPr>
-        <w:t>()</w:t>
+        <w:t>: authenticateClient(), matchClients(), relayData()</w:t>
       </w:r>
     </w:p>
     <w:p>
@@ -1537,7 +1305,7 @@
       </w:r>
     </w:p>
   </w:comment>
-  <w:comment w:id="1" w:author="Nathan Phan" w:date="2024-11-12T00:18:00Z" w:initials="">
+  <w:comment w:id="1" w:author="Nathan PHAN" w:date="2024-11-12T00:18:00Z" w:initials="">
     <w:p>
       <w:pPr>
         <w:widowControl w:val="0"/>
@@ -1685,7 +1453,7 @@
       </w:r>
     </w:p>
   </w:comment>
-  <w:comment w:id="3" w:author="Nathan Phan" w:date="2024-11-12T01:35:00Z" w:initials="">
+  <w:comment w:id="3" w:author="Nathan PHAN" w:date="2024-11-12T01:35:00Z" w:initials="">
     <w:p>
       <w:r>
         <w:rPr>
@@ -1947,7 +1715,7 @@
       </w:r>
     </w:p>
   </w:comment>
-  <w:comment w:id="8" w:author="Nathan Phan" w:date="2024-11-12T04:32:00Z" w:initials="">
+  <w:comment w:id="8" w:author="Nathan PHAN" w:date="2024-11-12T04:32:00Z" w:initials="">
     <w:p>
       <w:r>
         <w:rPr>
@@ -1955,6 +1723,142 @@
           <w:szCs w:val="20"/>
         </w:rPr>
         <w:t>I see that this class will be the backbone of the networking module. It covers all the core functionalities but that might be an issue as it can become very complex. Having a main networking loop with all the functionalities can get overly complex which can make maintenance hard. A singleton would help streamline and maintain consistency or maybe offload some specific responsibilities to a more focused class. Your attributes and methods are consistent with the description above</w:t>
+      </w:r>
+    </w:p>
+  </w:comment>
+  <w:comment w:id="9" w:author="Nathan PHAN" w:date="2024-11-12T10:57:00Z" w:initials="NP">
+    <w:p>
+      <w:r>
+        <w:rPr>
+          <w:rStyle w:val="CommentReference"/>
+        </w:rPr>
+        <w:annotationRef/>
+      </w:r>
+      <w:r>
+        <w:rPr>
+          <w:sz w:val="20"/>
+          <w:szCs w:val="20"/>
+        </w:rPr>
+        <w:t>I see that you have a preLoop method for the networking class, which I’m assuming that it is some condition to start the run method? I’m not too sure on what this method does, but I’m assuming that it’s some sort of condition that will start the main loop since everything will be under the main networking loop. Please provide some clarification!</w:t>
+      </w:r>
+    </w:p>
+  </w:comment>
+  <w:comment w:id="10" w:author="Nathan PHAN" w:date="2024-11-12T11:03:00Z" w:initials="NP">
+    <w:p>
+      <w:r>
+        <w:rPr>
+          <w:rStyle w:val="CommentReference"/>
+        </w:rPr>
+        <w:annotationRef/>
+      </w:r>
+      <w:r>
+        <w:rPr>
+          <w:sz w:val="20"/>
+          <w:szCs w:val="20"/>
+        </w:rPr>
+        <w:t>I can see that the class is well defined! All the attributes and methods are related to the goal of AuthenticationHandler, which is to authenticate any logins or profile creations. It was a good idea to separate it from the main networking class as it can just solely focus on login/registration interactions.  The methods in AuthenticationHandler covers all the essential steps in the authentication process, so this provides a good structure for managing user access</w:t>
+      </w:r>
+    </w:p>
+  </w:comment>
+  <w:comment w:id="11" w:author="Nathan PHAN" w:date="2024-11-12T11:13:00Z" w:initials="NP">
+    <w:p>
+      <w:r>
+        <w:rPr>
+          <w:rStyle w:val="CommentReference"/>
+        </w:rPr>
+        <w:annotationRef/>
+      </w:r>
+      <w:r>
+        <w:rPr>
+          <w:sz w:val="20"/>
+          <w:szCs w:val="20"/>
+        </w:rPr>
+        <w:t>This might be a bit nit picky but I was just wondering on how you guys would store username and password? Storing passwords in plain text as an attribute is feasible for sure in this class, but if it were to be an actual product then it can raises some concerns for security risks. It might be safer to handle passwords temporarily during the login process.</w:t>
+      </w:r>
+    </w:p>
+  </w:comment>
+  <w:comment w:id="12" w:author="Nathan PHAN" w:date="2024-11-12T11:07:00Z" w:initials="NP">
+    <w:p>
+      <w:r>
+        <w:rPr>
+          <w:rStyle w:val="CommentReference"/>
+        </w:rPr>
+        <w:annotationRef/>
+      </w:r>
+      <w:r>
+        <w:rPr>
+          <w:sz w:val="20"/>
+          <w:szCs w:val="20"/>
+        </w:rPr>
+        <w:t xml:space="preserve">Not too sure on how this will work? Will it be a boolean condition where if everything is authenticated, it returns a true? </w:t>
+      </w:r>
+    </w:p>
+  </w:comment>
+  <w:comment w:id="13" w:author="Nathan PHAN" w:date="2024-11-12T11:38:00Z" w:initials="NP">
+    <w:p>
+      <w:r>
+        <w:rPr>
+          <w:rStyle w:val="CommentReference"/>
+        </w:rPr>
+        <w:annotationRef/>
+      </w:r>
+      <w:r>
+        <w:rPr>
+          <w:sz w:val="20"/>
+          <w:szCs w:val="20"/>
+        </w:rPr>
+        <w:t xml:space="preserve">Very good! the description aligns well with the attributes and methods that are associated with LeaderboardHandler. I see that you guys used encapsulation by isolating leaderboard operations within a single class! All the core functionalities of LeaderboardHandler is covered by the methods which includes the essential retrieving and updating leaderboard data. One critique I would  add is that there is no clarification on how the leaderboard will be sorted? Try using a data structure to sort  the leaderboard such as a priority queue. You may need an extra attribute for example, lastUpdated, where it indicates to the player when the leaderboard has been last updated so it can provide to the player some clarity as sometimes they want to track their progress while in game. </w:t>
+      </w:r>
+    </w:p>
+  </w:comment>
+  <w:comment w:id="14" w:author="Nathan PHAN" w:date="2024-11-12T11:47:00Z" w:initials="NP">
+    <w:p>
+      <w:r>
+        <w:rPr>
+          <w:rStyle w:val="CommentReference"/>
+        </w:rPr>
+        <w:annotationRef/>
+      </w:r>
+      <w:r>
+        <w:rPr>
+          <w:sz w:val="20"/>
+          <w:szCs w:val="20"/>
+        </w:rPr>
+        <w:t>This class is well defined with the sole responsibility for handling any chat communication. It covers all the core necessities of what a chatManager should do such as send message, receive message, and decode message. Some suggestions I would add to messageQueue would be some sort of mechanism to limit the size of messages. There could be a possibility where messages can accumulate faster than they are processed, which can lead to a memory overflow. Some ideas could be that you can remove old messages after a certain limit is reached.</w:t>
+      </w:r>
+    </w:p>
+  </w:comment>
+  <w:comment w:id="15" w:author="Nathan PHAN" w:date="2024-11-12T12:07:00Z" w:initials="NP">
+    <w:p>
+      <w:r>
+        <w:rPr>
+          <w:rStyle w:val="CommentReference"/>
+        </w:rPr>
+        <w:annotationRef/>
+      </w:r>
+      <w:r>
+        <w:rPr>
+          <w:sz w:val="20"/>
+          <w:szCs w:val="20"/>
+        </w:rPr>
+        <w:t>Very good! I do agree that having a separate is beneficial to handle all the synchronization between the board state to clients. I will touch on Hannah’s point as well as there doesn’t seem to be an indication of how it will be terminated, leading to a never ending game. Other than that, there are no critiques or suggestions I would add except the termination conditions.</w:t>
+      </w:r>
+    </w:p>
+  </w:comment>
+  <w:comment w:id="16" w:author="Nathan PHAN" w:date="2024-11-12T12:13:00Z" w:initials="NP">
+    <w:p>
+      <w:r>
+        <w:rPr>
+          <w:rStyle w:val="CommentReference"/>
+        </w:rPr>
+        <w:annotationRef/>
+      </w:r>
+      <w:r>
+        <w:rPr>
+          <w:sz w:val="20"/>
+          <w:szCs w:val="20"/>
+        </w:rPr>
+        <w:t xml:space="preserve">Also adding onto Hannah’s point from above, it seems like this class might be redundant as the Networking class seems to take care of everything this class wants to achieve. I agree with Hannah’s suggestion if this class were to be changed into Matchmaking Manager instead, it just seems very inefficient to have ServerRelay practically do almost the same thing as Networking Class. </w:t>
       </w:r>
     </w:p>
   </w:comment>
@@ -1972,7 +1876,28 @@
   <w15:commentEx w15:paraId="00000040" w15:done="0"/>
   <w15:commentEx w15:paraId="00000046" w15:done="0"/>
   <w15:commentEx w15:paraId="00000033" w15:done="0"/>
+  <w15:commentEx w15:paraId="4F85C698" w15:done="0"/>
+  <w15:commentEx w15:paraId="26BF9F64" w15:done="0"/>
+  <w15:commentEx w15:paraId="366BAE20" w15:done="0"/>
+  <w15:commentEx w15:paraId="4D012876" w15:done="0"/>
+  <w15:commentEx w15:paraId="76978330" w15:done="0"/>
+  <w15:commentEx w15:paraId="4D2312BF" w15:done="0"/>
+  <w15:commentEx w15:paraId="152BD8BB" w15:done="0"/>
+  <w15:commentEx w15:paraId="02CE0478" w15:done="0"/>
 </w15:commentsEx>
+</file>
+
+<file path=word/commentsExtensible.xml><?xml version="1.0" encoding="utf-8"?>
+<w16cex:commentsExtensible xmlns:wpc="http://schemas.microsoft.com/office/word/2010/wordprocessingCanvas" xmlns:cx="http://schemas.microsoft.com/office/drawing/2014/chartex" xmlns:cx1="http://schemas.microsoft.com/office/drawing/2015/9/8/chartex" xmlns:cx2="http://schemas.microsoft.com/office/drawing/2015/10/21/chartex" xmlns:cx3="http://schemas.microsoft.com/office/drawing/2016/5/9/chartex" xmlns:cx4="http://schemas.microsoft.com/office/drawing/2016/5/10/chartex" xmlns:cx5="http://schemas.microsoft.com/office/drawing/2016/5/11/chartex" xmlns:cx6="http://schemas.microsoft.com/office/drawing/2016/5/12/chartex" xmlns:cx7="http://schemas.microsoft.com/office/drawing/2016/5/13/chartex" xmlns:cx8="http://schemas.microsoft.com/office/drawing/2016/5/14/chartex" xmlns:cr="http://schemas.microsoft.com/office/comments/2020/reactions" xmlns:mc="http://schemas.openxmlformats.org/markup-compatibility/2006" xmlns:aink="http://schemas.microsoft.com/office/drawing/2016/ink" xmlns:am3d="http://schemas.microsoft.com/office/drawing/2017/model3d" xmlns:o="urn:schemas-microsoft-com:office:office" xmlns:oel="http://schemas.microsoft.com/office/2019/extlst" xmlns:r="http://schemas.openxmlformats.org/officeDocument/2006/relationships" xmlns:m="http://schemas.openxmlformats.org/officeDocument/2006/math" xmlns:v="urn:schemas-microsoft-com:vml" xmlns:wp14="http://schemas.microsoft.com/office/word/2010/wordprocessingDrawing" xmlns:wp="http://schemas.openxmlformats.org/drawingml/2006/wordprocessingDrawing" xmlns:w10="urn:schemas-microsoft-com:office:word" xmlns:w="http://schemas.openxmlformats.org/wordprocessingml/2006/main" xmlns:w14="http://schemas.microsoft.com/office/word/2010/wordml" xmlns:w15="http://schemas.microsoft.com/office/word/2012/wordml" xmlns:w16cex="http://schemas.microsoft.com/office/word/2018/wordml/cex" xmlns:w16cid="http://schemas.microsoft.com/office/word/2016/wordml/cid" xmlns:w16="http://schemas.microsoft.com/office/word/2018/wordml" xmlns:w16du="http://schemas.microsoft.com/office/word/2023/wordml/word16du" xmlns:w16sdtdh="http://schemas.microsoft.com/office/word/2020/wordml/sdtdatahash" xmlns:w16se="http://schemas.microsoft.com/office/word/2015/wordml/symex" xmlns:wpg="http://schemas.microsoft.com/office/word/2010/wordprocessingGroup" xmlns:wpi="http://schemas.microsoft.com/office/word/2010/wordprocessingInk" xmlns:wne="http://schemas.microsoft.com/office/word/2006/wordml" xmlns:wps="http://schemas.microsoft.com/office/word/2010/wordprocessingShape" mc:Ignorable="w14 w15 w16se w16cid w16 w16cex w16sdtdh cr w16du wp14">
+  <w16cex:commentExtensible w16cex:durableId="32521DBD" w16cex:dateUtc="2024-11-12T17:57:00Z"/>
+  <w16cex:commentExtensible w16cex:durableId="5528E43F" w16cex:dateUtc="2024-11-12T18:03:00Z"/>
+  <w16cex:commentExtensible w16cex:durableId="768FF2AB" w16cex:dateUtc="2024-11-12T18:13:00Z"/>
+  <w16cex:commentExtensible w16cex:durableId="39970BDC" w16cex:dateUtc="2024-11-12T18:07:00Z"/>
+  <w16cex:commentExtensible w16cex:durableId="4AF01D9E" w16cex:dateUtc="2024-11-12T18:38:00Z"/>
+  <w16cex:commentExtensible w16cex:durableId="17286506" w16cex:dateUtc="2024-11-12T18:47:00Z"/>
+  <w16cex:commentExtensible w16cex:durableId="45FEF159" w16cex:dateUtc="2024-11-12T19:07:00Z"/>
+  <w16cex:commentExtensible w16cex:durableId="4D287A6C" w16cex:dateUtc="2024-11-12T19:13:00Z"/>
+</w16cex:commentsExtensible>
 </file>
 
 <file path=word/commentsIds.xml><?xml version="1.0" encoding="utf-8"?>
@@ -1986,6 +1911,14 @@
   <w16cid:commentId w16cid:paraId="00000040" w16cid:durableId="3FDC90BC"/>
   <w16cid:commentId w16cid:paraId="00000046" w16cid:durableId="4802FBE2"/>
   <w16cid:commentId w16cid:paraId="00000033" w16cid:durableId="1A659659"/>
+  <w16cid:commentId w16cid:paraId="4F85C698" w16cid:durableId="32521DBD"/>
+  <w16cid:commentId w16cid:paraId="26BF9F64" w16cid:durableId="5528E43F"/>
+  <w16cid:commentId w16cid:paraId="366BAE20" w16cid:durableId="768FF2AB"/>
+  <w16cid:commentId w16cid:paraId="4D012876" w16cid:durableId="39970BDC"/>
+  <w16cid:commentId w16cid:paraId="76978330" w16cid:durableId="4AF01D9E"/>
+  <w16cid:commentId w16cid:paraId="4D2312BF" w16cid:durableId="17286506"/>
+  <w16cid:commentId w16cid:paraId="152BD8BB" w16cid:durableId="45FEF159"/>
+  <w16cid:commentId w16cid:paraId="02CE0478" w16cid:durableId="4D287A6C"/>
 </w16cid:commentsIds>
 </file>
 
@@ -2086,6 +2019,14 @@
     <w:abstractNumId w:val="0"/>
   </w:num>
 </w:numbering>
+</file>
+
+<file path=word/people.xml><?xml version="1.0" encoding="utf-8"?>
+<w15:people xmlns:wpc="http://schemas.microsoft.com/office/word/2010/wordprocessingCanvas" xmlns:cx="http://schemas.microsoft.com/office/drawing/2014/chartex" xmlns:cx1="http://schemas.microsoft.com/office/drawing/2015/9/8/chartex" xmlns:cx2="http://schemas.microsoft.com/office/drawing/2015/10/21/chartex" xmlns:cx3="http://schemas.microsoft.com/office/drawing/2016/5/9/chartex" xmlns:cx4="http://schemas.microsoft.com/office/drawing/2016/5/10/chartex" xmlns:cx5="http://schemas.microsoft.com/office/drawing/2016/5/11/chartex" xmlns:cx6="http://schemas.microsoft.com/office/drawing/2016/5/12/chartex" xmlns:cx7="http://schemas.microsoft.com/office/drawing/2016/5/13/chartex" xmlns:cx8="http://schemas.microsoft.com/office/drawing/2016/5/14/chartex" xmlns:mc="http://schemas.openxmlformats.org/markup-compatibility/2006" xmlns:aink="http://schemas.microsoft.com/office/drawing/2016/ink" xmlns:am3d="http://schemas.microsoft.com/office/drawing/2017/model3d" xmlns:o="urn:schemas-microsoft-com:office:office" xmlns:oel="http://schemas.microsoft.com/office/2019/extlst" xmlns:r="http://schemas.openxmlformats.org/officeDocument/2006/relationships" xmlns:m="http://schemas.openxmlformats.org/officeDocument/2006/math" xmlns:v="urn:schemas-microsoft-com:vml" xmlns:wp14="http://schemas.microsoft.com/office/word/2010/wordprocessingDrawing" xmlns:wp="http://schemas.openxmlformats.org/drawingml/2006/wordprocessingDrawing" xmlns:w10="urn:schemas-microsoft-com:office:word" xmlns:w="http://schemas.openxmlformats.org/wordprocessingml/2006/main" xmlns:w14="http://schemas.microsoft.com/office/word/2010/wordml" xmlns:w15="http://schemas.microsoft.com/office/word/2012/wordml" xmlns:w16cex="http://schemas.microsoft.com/office/word/2018/wordml/cex" xmlns:w16cid="http://schemas.microsoft.com/office/word/2016/wordml/cid" xmlns:w16="http://schemas.microsoft.com/office/word/2018/wordml" xmlns:w16du="http://schemas.microsoft.com/office/word/2023/wordml/word16du" xmlns:w16sdtdh="http://schemas.microsoft.com/office/word/2020/wordml/sdtdatahash" xmlns:w16se="http://schemas.microsoft.com/office/word/2015/wordml/symex" xmlns:wpg="http://schemas.microsoft.com/office/word/2010/wordprocessingGroup" xmlns:wpi="http://schemas.microsoft.com/office/word/2010/wordprocessingInk" xmlns:wne="http://schemas.microsoft.com/office/word/2006/wordml" xmlns:wps="http://schemas.microsoft.com/office/word/2010/wordprocessingShape" mc:Ignorable="w14 w15 w16se w16cid w16 w16cex w16sdtdh w16du wp14">
+  <w15:person w15:author="Nathan PHAN">
+    <w15:presenceInfo w15:providerId="AD" w15:userId="S::nathan.phan@ucalgary.ca::4e5ea50b-df17-42ae-a7cf-b94393eb52e6"/>
+  </w15:person>
+</w15:people>
 </file>
 
 <file path=word/styles.xml><?xml version="1.0" encoding="utf-8"?>
@@ -3026,6 +2967,34 @@
       <w:szCs w:val="16"/>
     </w:rPr>
   </w:style>
+  <w:style w:type="paragraph" w:styleId="CommentSubject">
+    <w:name w:val="annotation subject"/>
+    <w:basedOn w:val="CommentText"/>
+    <w:next w:val="CommentText"/>
+    <w:link w:val="CommentSubjectChar"/>
+    <w:uiPriority w:val="99"/>
+    <w:semiHidden/>
+    <w:unhideWhenUsed/>
+    <w:rsid w:val="004A3C95"/>
+    <w:rPr>
+      <w:b/>
+      <w:bCs/>
+    </w:rPr>
+  </w:style>
+  <w:style w:type="character" w:customStyle="1" w:styleId="CommentSubjectChar">
+    <w:name w:val="Comment Subject Char"/>
+    <w:basedOn w:val="CommentTextChar"/>
+    <w:link w:val="CommentSubject"/>
+    <w:uiPriority w:val="99"/>
+    <w:semiHidden/>
+    <w:rsid w:val="004A3C95"/>
+    <w:rPr>
+      <w:b/>
+      <w:bCs/>
+      <w:sz w:val="20"/>
+      <w:szCs w:val="20"/>
+    </w:rPr>
+  </w:style>
 </w:styles>
 </file>
 

</xml_diff>